<commit_message>
Aggiunti prima bozza di borghi: Casignana, Brancaleone, bianco
</commit_message>
<xml_diff>
--- a/Materiale Progetto RAI/Tutti i borghi in un file.docx
+++ b/Materiale Progetto RAI/Tutti i borghi in un file.docx
@@ -2537,7 +2537,7 @@
           <w14:ligatures w14:val="none"/>
         </w:rPr>
         <w:pict w14:anchorId="4A6EE3A1">
-          <v:rect id="_x0000_i1027" alt="" style="width:481.9pt;height:.05pt;mso-width-percent:0;mso-height-percent:0;mso-width-percent:0;mso-height-percent:0" o:hralign="center" o:hrstd="t" o:hr="t" fillcolor="#a0a0a0" stroked="f"/>
+          <v:rect id="_x0000_i1026" alt="" style="width:481.9pt;height:.05pt;mso-width-percent:0;mso-height-percent:0;mso-width-percent:0;mso-height-percent:0" o:hralign="center" o:hrstd="t" o:hr="t" fillcolor="#a0a0a0" stroked="f"/>
         </w:pict>
       </w:r>
     </w:p>
@@ -6328,6 +6328,1298 @@
       </w:pPr>
     </w:p>
     <w:p/>
+    <w:p>
+      <w:pPr>
+        <w:rPr>
+          <w:b/>
+          <w:bCs/>
+        </w:rPr>
+      </w:pPr>
+      <w:r>
+        <w:rPr>
+          <w:b/>
+          <w:bCs/>
+        </w:rPr>
+        <w:t xml:space="preserve">BOVALINO </w:t>
+      </w:r>
+    </w:p>
+    <w:p/>
+    <w:p>
+      <w:r>
+        <w:t xml:space="preserve">Bovalino Superiore contiene il castello costruito dal Conte Ruggero d'Altavilla detto il Normanno dopo la conquista dei Normanni del meridione (1059); in passato era un maestoso castello reale per l'amministrazione del territorio e venne affidato alla famiglia </w:t>
+      </w:r>
+      <w:proofErr w:type="spellStart"/>
+      <w:r>
+        <w:t>Conclubet</w:t>
+      </w:r>
+      <w:proofErr w:type="spellEnd"/>
+      <w:r>
+        <w:t>, signori d'Arena, di Stilo e di Gerace. Il Castello è oggi in fase avanzata di ristrutturazione ed i lavori dovrebbero essere completati a breve.</w:t>
+      </w:r>
+    </w:p>
+    <w:p>
+      <w:r>
+        <w:t>"Chiesa Parrocchiale di Santa Maria della Neve e Santa Caterina Vergine". Edificio a tre navate di fondazione medievale di stile romanico rifatto nel XVI secolo e restaurato dopo i terremoti del 1783 e del 1908.</w:t>
+      </w:r>
+    </w:p>
+    <w:p>
+      <w:r>
+        <w:t xml:space="preserve">"Chiesa di Santa Maria del Soccorso" </w:t>
+      </w:r>
+      <w:proofErr w:type="gramStart"/>
+      <w:r>
+        <w:t>( o</w:t>
+      </w:r>
+      <w:proofErr w:type="gramEnd"/>
+      <w:r>
+        <w:t xml:space="preserve"> "del Rosario"). Oratorio fondato in età normanna (sec. XI) e rifatto in periodo rinascimentale (a. 1586). Avanzi della costruzione con bel portale </w:t>
+      </w:r>
+      <w:proofErr w:type="spellStart"/>
+      <w:r>
+        <w:t>ogivo</w:t>
+      </w:r>
+      <w:proofErr w:type="spellEnd"/>
+      <w:r>
+        <w:t xml:space="preserve"> d'impronta gotico - romanica del 1400 (Monumento Nazionale). Da Bovalino Superiore si godono panorami stupendi. </w:t>
+      </w:r>
+    </w:p>
+    <w:p>
+      <w:r>
+        <w:t>Si celebrano due feste importanti:</w:t>
+      </w:r>
+    </w:p>
+    <w:p>
+      <w:r>
+        <w:t xml:space="preserve">Madonna del Carmine (ultima Domenica di </w:t>
+      </w:r>
+      <w:proofErr w:type="gramStart"/>
+      <w:r>
+        <w:t>Luglio</w:t>
+      </w:r>
+      <w:proofErr w:type="gramEnd"/>
+      <w:r>
+        <w:t>);</w:t>
+      </w:r>
+    </w:p>
+    <w:p>
+      <w:r>
+        <w:t>Immacolata Concezione (Otto settembre).</w:t>
+      </w:r>
+    </w:p>
+    <w:p>
+      <w:r>
+        <w:t xml:space="preserve">A Nord, poco distante, è situato il borgo dello </w:t>
+      </w:r>
+      <w:proofErr w:type="spellStart"/>
+      <w:r>
+        <w:t>Zopardo</w:t>
+      </w:r>
+      <w:proofErr w:type="spellEnd"/>
+      <w:r>
+        <w:t xml:space="preserve"> con l'antica chiesa delle Grazie e del SS. Rosario in fase di ristrutturazione;</w:t>
+      </w:r>
+    </w:p>
+    <w:p>
+      <w:r>
+        <w:lastRenderedPageBreak/>
+        <w:t>A Sud, invece, è collocato il borgo della Guarnaccia con la chiesa cinquecentesca di Santa Caterina.</w:t>
+      </w:r>
+    </w:p>
+    <w:p>
+      <w:r>
+        <w:t>Il centro storico è attraversato dalla SS 112 dell'Aspromonte. Sempre lungo la SS 112, tra Bovalino Marina e Bovalino Superiore, è posta la frazione Pozzo con la splendida chiesa di Santa Maria delle Grazie, da poco restaurata.</w:t>
+      </w:r>
+    </w:p>
+    <w:p>
+      <w:r>
+        <w:t xml:space="preserve">Nella pianura di </w:t>
+      </w:r>
+      <w:proofErr w:type="spellStart"/>
+      <w:r>
+        <w:t>Frazzà</w:t>
+      </w:r>
+      <w:proofErr w:type="spellEnd"/>
+      <w:r>
+        <w:t>, tra la fiumara Bonamico e la fiumara Careri, lungo la strada provinciale per San Luca, è situata la frazione di Bosco Sant'Ippolito con la moderna chiesa di San Martino.</w:t>
+      </w:r>
+    </w:p>
+    <w:p>
+      <w:r>
+        <w:t>Bovalino Marina, dalle spiagge di sabbia fine e dorata, naturalmente alternata da strati di pietrisco e breccio, è una cittadina di forte sviluppo turistico. Rappresenta un punto strategico per effettuare suggestive e indimenticabili escursioni nel vicino Aspromonte e nel fondale marino del suo splendido mare, ricco di flora marittima ed ellittica.</w:t>
+      </w:r>
+    </w:p>
+    <w:p/>
+    <w:p/>
+    <w:p/>
+    <w:p/>
+    <w:p/>
+    <w:p/>
+    <w:p/>
+    <w:p/>
+    <w:p/>
+    <w:p/>
+    <w:p/>
+    <w:p/>
+    <w:p>
+      <w:r>
+        <w:t xml:space="preserve">BORGO BOVALINO SUPERIORE </w:t>
+      </w:r>
+    </w:p>
+    <w:p>
+      <w:pPr>
+        <w:rPr>
+          <w:u w:val="single"/>
+        </w:rPr>
+      </w:pPr>
+      <w:r>
+        <w:rPr>
+          <w:u w:val="single"/>
+        </w:rPr>
+        <w:t xml:space="preserve">Il borgo di Bovalino Superiore rappresenta il nucleo storico dell’attuale comune di Bovalino, situato lungo la fascia ionica della Calabria meridionale, nella zona storica della Costa dei Gelsomini. Il centro storico sorge su una collina a circa 200 metri sul livello del mare, a pochi chilometri dalla </w:t>
+      </w:r>
+      <w:proofErr w:type="spellStart"/>
+      <w:proofErr w:type="gramStart"/>
+      <w:r>
+        <w:rPr>
+          <w:u w:val="single"/>
+        </w:rPr>
+        <w:t>costa.Il</w:t>
+      </w:r>
+      <w:proofErr w:type="spellEnd"/>
+      <w:proofErr w:type="gramEnd"/>
+      <w:r>
+        <w:rPr>
+          <w:u w:val="single"/>
+        </w:rPr>
+        <w:t xml:space="preserve"> borgo conserva ancora oggi le caratteristiche tipiche degli insediamenti medievali della Calabria: un impianto urbano compatto, vicoli stretti, edifici costruiti in pietra e una disposizione delle abitazioni sviluppata attorno a un’antica via principale.</w:t>
+      </w:r>
+    </w:p>
+    <w:p>
+      <w:pPr>
+        <w:rPr>
+          <w:u w:val="single"/>
+        </w:rPr>
+      </w:pPr>
+      <w:r>
+        <w:rPr>
+          <w:u w:val="single"/>
+        </w:rPr>
+        <w:t>Origini e insediamenti antichi</w:t>
+      </w:r>
+    </w:p>
+    <w:p>
+      <w:pPr>
+        <w:rPr>
+          <w:u w:val="single"/>
+        </w:rPr>
+      </w:pPr>
+      <w:r>
+        <w:rPr>
+          <w:u w:val="single"/>
+        </w:rPr>
+        <w:t xml:space="preserve">Il territorio di Bovalino presenta tracce di frequentazione già in epoca antica. La sua posizione geografica, infatti, lo colloca vicino alla città magnogreca di Locri </w:t>
+      </w:r>
+      <w:proofErr w:type="spellStart"/>
+      <w:r>
+        <w:rPr>
+          <w:u w:val="single"/>
+        </w:rPr>
+        <w:t>Epizefiri</w:t>
+      </w:r>
+      <w:proofErr w:type="spellEnd"/>
+      <w:r>
+        <w:rPr>
+          <w:u w:val="single"/>
+        </w:rPr>
+        <w:t>, una delle colonie più importanti della Magna Grecia. Durante il periodo greco e romano la zona fu probabilmente occupata da piccoli insediamenti agricoli e da ville rustiche legate alle attività agricole e commerciali della costa ionica. Alcuni reperti archeologici e iscrizioni greche rinvenute nel territorio testimoniano questa antica presenza umana.</w:t>
+      </w:r>
+    </w:p>
+    <w:p>
+      <w:pPr>
+        <w:rPr>
+          <w:u w:val="single"/>
+        </w:rPr>
+      </w:pPr>
+      <w:r>
+        <w:rPr>
+          <w:u w:val="single"/>
+        </w:rPr>
+        <w:t>Nel periodo bizantino, tra il VI e il X secolo, la Calabria ionica divenne un importante centro del monachesimo orientale. In quest’epoca numerosi monaci basiliani si stabilirono nella regione fondando eremi e piccoli monasteri che contribuirono alla diffusione della cultura religiosa greco-bizantina.</w:t>
+      </w:r>
+    </w:p>
+    <w:p>
+      <w:r>
+        <w:t>La formazione del borgo medievale</w:t>
+      </w:r>
+    </w:p>
+    <w:p>
+      <w:r>
+        <w:t xml:space="preserve">Il vero sviluppo dell’insediamento collinare avvenne durante il Medioevo. Secondo la tradizione storica locale, nel 986 un antico centro abitato situato lungo la costa fu distrutto a causa delle incursioni saracene, molto frequenti lungo le coste dell’Italia meridionale. Gli abitanti, per difendersi da nuovi attacchi, si rifugiarono su una collina più interna e più </w:t>
+      </w:r>
+      <w:r>
+        <w:lastRenderedPageBreak/>
+        <w:t>facilmente difendibile, dove nacque il nuovo insediamento di Bovalino Superiore. Con l’arrivo dei Normanni nell’Italia meridionale, il borgo assunse una funzione strategica di controllo del territorio. In questo periodo il conte normanno Ruggero I d'Altavilla fece costruire una fortificazione destinata alla difesa del territorio e della costa. Il castello normanno divenne il centro del sistema difensivo del paese e attorno ad esso si sviluppò un tipico borgo fortificato medievale con mura e porte di accesso.</w:t>
+      </w:r>
+    </w:p>
+    <w:p>
+      <w:r>
+        <w:t>L’incendio del borgo e la tradizione della Madonna Immacolata</w:t>
+      </w:r>
+    </w:p>
+    <w:p>
+      <w:r>
+        <w:t>Uno degli episodi più significativi tramandati dalla tradizione locale riguarda un grave incendio che colpì il borgo tra il XVI e il XVII secolo, durante una delle incursioni dei corsari turchi che frequentemente attaccavano i centri della costa ionica calabrese. Durante l’assalto il paese fu saccheggiato e molte abitazioni vennero incendiate. Le fiamme si diffusero rapidamente nel centro abitato, minacciando la distruzione completa del borgo. Secondo la tradizione popolare, gli abitanti si rifugiarono nella chiesa principale e si raccolsero in preghiera invocando la protezione della Madonna della Immacolata.</w:t>
+      </w:r>
+    </w:p>
+    <w:p>
+      <w:r>
+        <w:t>La leggenda racconta che, mentre il fuoco si avvicinava alla chiesa, il vento cambiò improvvisamente direzione, allontanando le fiamme dal centro abitato e salvando gran parte del borgo dalla distruzione. L’evento fu interpretato dalla popolazione come un intervento miracoloso della Madonna. Da quel momento la devozione verso la Madonna Immacolata divenne particolarmente intensa e la Vergine fu riconosciuta come protettrice della comunità.</w:t>
+      </w:r>
+    </w:p>
+    <w:p>
+      <w:r>
+        <w:t>Ancora oggi la festa dedicata alla Madonna Immacolata viene celebrata il 9 settembre, con una processione religiosa che attraversa il borgo.</w:t>
+      </w:r>
+    </w:p>
+    <w:p/>
+    <w:p/>
+    <w:p>
+      <w:r>
+        <w:t>Monumenti e patrimonio storico</w:t>
+      </w:r>
+    </w:p>
+    <w:p>
+      <w:r>
+        <w:t>Tra i principali edifici storici presenti nel borgo si possono ricordare:</w:t>
+      </w:r>
+    </w:p>
+    <w:p>
+      <w:r>
+        <w:t>il Castello Normanno, costruito tra XI e XII secolo e oggi visibile nei resti delle mura e delle strutture difensive;</w:t>
+      </w:r>
+    </w:p>
+    <w:p>
+      <w:r>
+        <w:t>la Chiesa Matrice di Santa Maria ad Nives e San Nicola di Bari, risalente al XVI secolo;</w:t>
+      </w:r>
+    </w:p>
+    <w:p>
+      <w:r>
+        <w:t>la Chiesa di Santa Caterina d’Alessandria, edificata nel 1586.</w:t>
+      </w:r>
+    </w:p>
+    <w:p>
+      <w:r>
+        <w:t>Questi edifici rappresentano importanti testimonianze della storia religiosa e civile del borgo.</w:t>
+      </w:r>
+    </w:p>
+    <w:p/>
+    <w:p>
+      <w:pPr>
+        <w:rPr>
+          <w:u w:val="single"/>
+        </w:rPr>
+      </w:pPr>
+      <w:r>
+        <w:rPr>
+          <w:u w:val="single"/>
+        </w:rPr>
+        <w:t>Personaggi e figure culturali legate al territorio</w:t>
+      </w:r>
+    </w:p>
+    <w:p>
+      <w:pPr>
+        <w:rPr>
+          <w:u w:val="single"/>
+        </w:rPr>
+      </w:pPr>
+      <w:r>
+        <w:rPr>
+          <w:u w:val="single"/>
+        </w:rPr>
+        <w:t>Il territorio della Locride e di Bovalino è stato legato nel tempo a diverse figure di rilievo nel panorama culturale italiano.</w:t>
+      </w:r>
+    </w:p>
+    <w:p>
+      <w:pPr>
+        <w:rPr>
+          <w:u w:val="single"/>
+        </w:rPr>
+      </w:pPr>
+      <w:r>
+        <w:rPr>
+          <w:u w:val="single"/>
+        </w:rPr>
+        <w:t>Tra queste si distingue lo scrittore Corrado Alvaro, nato nel vicino centro di San Luca. Considerato uno dei maggiori autori italiani del Novecento, Alvaro ha raccontato nelle sue opere la vita e le tradizioni della Calabria meridionale, descrivendo spesso le difficoltà sociali e culturali delle comunità dell’Aspromonte e della costa ionica.</w:t>
+      </w:r>
+    </w:p>
+    <w:p>
+      <w:pPr>
+        <w:rPr>
+          <w:u w:val="single"/>
+        </w:rPr>
+      </w:pPr>
+      <w:r>
+        <w:rPr>
+          <w:u w:val="single"/>
+        </w:rPr>
+        <w:t>Tra le figure legate direttamente alla comunità di Bovalino si ricorda inoltre il poeta e scrittore Giuseppe Zappone, autore di opere dedicate alla cultura e alla memoria storica locale.</w:t>
+      </w:r>
+    </w:p>
+    <w:p>
+      <w:r>
+        <w:t>Nel corso dei secoli il territorio fu inoltre governato da diverse famiglie feudali, tra cui la famiglia Marullo, che ebbe un ruolo importante nella vita politica e militare dell’area durante il periodo feudale.</w:t>
+      </w:r>
+    </w:p>
+    <w:p/>
+    <w:p>
+      <w:pPr>
+        <w:rPr>
+          <w:u w:val="single"/>
+        </w:rPr>
+      </w:pPr>
+      <w:r>
+        <w:rPr>
+          <w:u w:val="single"/>
+        </w:rPr>
+        <w:t>Tra le figure culturali più importanti legate a Bovalino vi è lo scrittore Mario La Cava.</w:t>
+      </w:r>
+    </w:p>
+    <w:p>
+      <w:pPr>
+        <w:rPr>
+          <w:u w:val="single"/>
+        </w:rPr>
+      </w:pPr>
+      <w:r>
+        <w:rPr>
+          <w:u w:val="single"/>
+        </w:rPr>
+        <w:t>Mario La Cava nacque a Bovalino nel 1908 e trascorse gran parte della sua vita nel paese natale. È considerato uno dei più importanti scrittori calabresi del Novecento.</w:t>
+      </w:r>
+    </w:p>
+    <w:p>
+      <w:r>
+        <w:lastRenderedPageBreak/>
+        <w:t>La sua produzione letteraria è profondamente legata alla realtà sociale e culturale della Calabria meridionale. Nei suoi romanzi e racconti descrisse la vita quotidiana delle comunità della Locride, le difficoltà economiche, le tradizioni popolari e i cambiamenti della società nel corso del Novecento.</w:t>
+      </w:r>
+    </w:p>
+    <w:p>
+      <w:r>
+        <w:t>Tra le sue opere più importanti si ricordano:</w:t>
+      </w:r>
+    </w:p>
+    <w:p>
+      <w:r>
+        <w:t>Caratteri (1939)</w:t>
+      </w:r>
+    </w:p>
+    <w:p>
+      <w:r>
+        <w:t>I fatti di Casignana (1964)</w:t>
+      </w:r>
+    </w:p>
+    <w:p>
+      <w:r>
+        <w:t>Il matrimonio di Caterina (1977)</w:t>
+      </w:r>
+    </w:p>
+    <w:p>
+      <w:r>
+        <w:t>Le sue opere sono caratterizzate da uno stile realistico e attento alla dimensione umana dei personaggi. Attraverso la letteratura, La Cava ha contribuito a raccontare la realtà della Calabria lontana dagli stereotipi, mettendo in luce la complessità della vita sociale e culturale della regione.</w:t>
+      </w:r>
+    </w:p>
+    <w:p>
+      <w:r>
+        <w:t>A Bovalino oggi esiste una casa-museo dedicata allo scrittore, che conserva libri, documenti e testimonianze della sua vita e della sua attività letteraria.</w:t>
+      </w:r>
+    </w:p>
+    <w:p/>
+    <w:p>
+      <w:pPr>
+        <w:rPr>
+          <w:u w:val="single"/>
+        </w:rPr>
+      </w:pPr>
+      <w:r>
+        <w:rPr>
+          <w:u w:val="single"/>
+        </w:rPr>
+        <w:t>Conclusione</w:t>
+      </w:r>
+    </w:p>
+    <w:p>
+      <w:pPr>
+        <w:rPr>
+          <w:u w:val="single"/>
+        </w:rPr>
+      </w:pPr>
+      <w:r>
+        <w:rPr>
+          <w:u w:val="single"/>
+        </w:rPr>
+        <w:t>Il borgo di Bovalino Superiore rappresenta una significativa testimonianza della storia della Calabria ionica. Le sue origini antiche, lo sviluppo medievale attorno al castello normanno, le tradizioni religiose legate alla Madonna della Neve e la presenza di importanti figure culturali del territorio contribuiscono a definire l’identità storica e culturale della comunità.</w:t>
+      </w:r>
+    </w:p>
+    <w:p>
+      <w:r>
+        <w:t>Nonostante lo sviluppo moderno si sia spostato verso la zona costiera di Bovalino Marina, il borgo antico conserva ancora oggi il fascino della sua storia e rappresenta un importante patrimonio storico, architettonico e culturale della Locride.</w:t>
+      </w:r>
+    </w:p>
+    <w:p/>
+    <w:p>
+      <w:pPr>
+        <w:rPr>
+          <w:b/>
+          <w:bCs/>
+        </w:rPr>
+      </w:pPr>
+      <w:r>
+        <w:rPr>
+          <w:b/>
+          <w:bCs/>
+        </w:rPr>
+        <w:t>La Costa dei Gelsomini: dove storia, natura e profumo di Mediterraneo si incontrano</w:t>
+      </w:r>
+    </w:p>
+    <w:p>
+      <w:r>
+        <w:t xml:space="preserve">La Costa dei Gelsomini, conosciuta anche come </w:t>
+      </w:r>
+      <w:r>
+        <w:rPr>
+          <w:b/>
+          <w:bCs/>
+        </w:rPr>
+        <w:t>Locride</w:t>
+      </w:r>
+      <w:r>
+        <w:t xml:space="preserve">, è una delle destinazioni più affascinanti della Calabria. Si estende lungo la costa ionica della Città metropolitana di Reggio Calabria, tra Punta Stilo e Capo </w:t>
+      </w:r>
+      <w:proofErr w:type="spellStart"/>
+      <w:r>
+        <w:t>Spartivento</w:t>
+      </w:r>
+      <w:proofErr w:type="spellEnd"/>
+      <w:r>
+        <w:t>.</w:t>
+      </w:r>
+    </w:p>
+    <w:p>
+      <w:r>
+        <w:t>Qui il mare cristallino, la storia millenaria e il profumo del gelsomino creano un’esperienza autentica e memorabile.</w:t>
+      </w:r>
+    </w:p>
+    <w:p>
+      <w:r>
+        <w:t>Il nome “</w:t>
+      </w:r>
+      <w:r>
+        <w:rPr>
+          <w:b/>
+          <w:bCs/>
+        </w:rPr>
+        <w:t>Costa dei Gelsomini</w:t>
+      </w:r>
+      <w:r>
+        <w:t>” nasce dalla storica coltivazione del Gelsomino, diffusa lungo tutta la fascia costiera.</w:t>
+      </w:r>
+    </w:p>
+    <w:p>
+      <w:r>
+        <w:t xml:space="preserve">I suoi fiori venivano raccolti dalle </w:t>
+      </w:r>
+      <w:proofErr w:type="spellStart"/>
+      <w:r>
+        <w:rPr>
+          <w:i/>
+          <w:iCs/>
+        </w:rPr>
+        <w:t>gelsominaie</w:t>
+      </w:r>
+      <w:proofErr w:type="spellEnd"/>
+      <w:r>
+        <w:t>, donne che all’alba raccoglievano i delicati boccioli destinati all’industria dei profumi.</w:t>
+      </w:r>
+    </w:p>
+    <w:p>
+      <w:r>
+        <w:t>Questi preziosi fiori venivano esportati soprattutto in Francia, patria della profumeria, contribuendo a rendere la zona un punto di riferimento internazionale per le essenze naturali.</w:t>
+      </w:r>
+    </w:p>
+    <w:p>
+      <w:r>
+        <w:t xml:space="preserve">Un luogo particolarmente importante per la biodiversità è </w:t>
+      </w:r>
+      <w:r>
+        <w:rPr>
+          <w:b/>
+          <w:bCs/>
+        </w:rPr>
+        <w:t>BRANCALEONE</w:t>
+      </w:r>
+      <w:r>
+        <w:t xml:space="preserve">, dove ogni anno nidifica la </w:t>
+      </w:r>
+      <w:r>
+        <w:rPr>
+          <w:i/>
+          <w:iCs/>
+        </w:rPr>
+        <w:t xml:space="preserve">tartaruga marina Caretta </w:t>
+      </w:r>
+      <w:proofErr w:type="spellStart"/>
+      <w:r>
+        <w:rPr>
+          <w:i/>
+          <w:iCs/>
+        </w:rPr>
+        <w:t>Caretta</w:t>
+      </w:r>
+      <w:proofErr w:type="spellEnd"/>
+      <w:r>
+        <w:t>, rendendo questa costa uno dei siti più preziosi del Mediterraneo per la conservazione della specie.</w:t>
+      </w:r>
+    </w:p>
+    <w:p>
+      <w:r>
+        <w:t>La Costa dei Gelsomini è anche un museo a cielo aperto, con testimonianze che attraversano epoche e civiltà.</w:t>
+      </w:r>
+    </w:p>
+    <w:p>
+      <w:pPr>
+        <w:rPr>
+          <w:b/>
+          <w:bCs/>
+        </w:rPr>
+      </w:pPr>
+      <w:r>
+        <w:rPr>
+          <w:b/>
+          <w:bCs/>
+        </w:rPr>
+        <w:t>Magna Grecia</w:t>
+      </w:r>
+    </w:p>
+    <w:p>
+      <w:r>
+        <w:t>Tra i siti più importanti troviamo:</w:t>
+      </w:r>
+    </w:p>
+    <w:p>
+      <w:pPr>
+        <w:numPr>
+          <w:ilvl w:val="0"/>
+          <w:numId w:val="6"/>
+        </w:numPr>
+        <w:rPr>
+          <w:i/>
+          <w:iCs/>
+        </w:rPr>
+      </w:pPr>
+      <w:r>
+        <w:rPr>
+          <w:i/>
+          <w:iCs/>
+        </w:rPr>
+        <w:t xml:space="preserve">Locri </w:t>
+      </w:r>
+      <w:proofErr w:type="spellStart"/>
+      <w:r>
+        <w:rPr>
+          <w:i/>
+          <w:iCs/>
+        </w:rPr>
+        <w:t>Epizefiri</w:t>
+      </w:r>
+      <w:proofErr w:type="spellEnd"/>
+      <w:r>
+        <w:rPr>
+          <w:i/>
+          <w:iCs/>
+        </w:rPr>
+        <w:t xml:space="preserve"> </w:t>
+      </w:r>
+      <w:r>
+        <w:t>famosa nel mondo antico per l'usanza della discendenza matrilineare e per essere stata la prima città della storia, nel 660 a.C. a dotarsi di un corpo di leggi scritte del legislatore Zaleuco.</w:t>
+      </w:r>
+    </w:p>
+    <w:p>
+      <w:pPr>
+        <w:numPr>
+          <w:ilvl w:val="0"/>
+          <w:numId w:val="6"/>
+        </w:numPr>
+      </w:pPr>
+      <w:proofErr w:type="spellStart"/>
+      <w:r>
+        <w:rPr>
+          <w:i/>
+          <w:iCs/>
+        </w:rPr>
+        <w:t>Kaulon</w:t>
+      </w:r>
+      <w:proofErr w:type="spellEnd"/>
+      <w:r>
+        <w:t xml:space="preserve"> che sorgeva nell’odierna località di</w:t>
+      </w:r>
+      <w:r>
+        <w:rPr>
+          <w:b/>
+          <w:bCs/>
+        </w:rPr>
+        <w:t> Monasterace Marina</w:t>
+      </w:r>
+      <w:r>
+        <w:t> presso il promontorio di </w:t>
+      </w:r>
+      <w:r>
+        <w:rPr>
+          <w:b/>
+          <w:bCs/>
+        </w:rPr>
+        <w:t>punta Stilo</w:t>
+      </w:r>
+    </w:p>
+    <w:p>
+      <w:r>
+        <w:lastRenderedPageBreak/>
+        <w:t>Queste antiche città raccontano il passato glorioso della Magna Grecia nel Sud Italia.</w:t>
+      </w:r>
+    </w:p>
+    <w:p>
+      <w:pPr>
+        <w:rPr>
+          <w:b/>
+          <w:bCs/>
+        </w:rPr>
+      </w:pPr>
+      <w:r>
+        <w:rPr>
+          <w:b/>
+          <w:bCs/>
+        </w:rPr>
+        <w:t>Epoca romana</w:t>
+      </w:r>
+    </w:p>
+    <w:p>
+      <w:r>
+        <w:t>L’eredità romana è visibile in straordinari complessi archeologici:</w:t>
+      </w:r>
+    </w:p>
+    <w:p>
+      <w:pPr>
+        <w:numPr>
+          <w:ilvl w:val="0"/>
+          <w:numId w:val="7"/>
+        </w:numPr>
+      </w:pPr>
+      <w:r>
+        <w:rPr>
+          <w:i/>
+          <w:iCs/>
+        </w:rPr>
+        <w:t xml:space="preserve">Area Archeologica del </w:t>
+      </w:r>
+      <w:proofErr w:type="spellStart"/>
+      <w:r>
+        <w:rPr>
+          <w:i/>
+          <w:iCs/>
+        </w:rPr>
+        <w:t>Naniglio</w:t>
+      </w:r>
+      <w:proofErr w:type="spellEnd"/>
+      <w:r>
+        <w:t xml:space="preserve"> (Gioiosa Ionica), importante complesso del II-III secolo d.C.</w:t>
+      </w:r>
+    </w:p>
+    <w:p>
+      <w:pPr>
+        <w:numPr>
+          <w:ilvl w:val="0"/>
+          <w:numId w:val="7"/>
+        </w:numPr>
+      </w:pPr>
+      <w:r>
+        <w:rPr>
+          <w:i/>
+          <w:iCs/>
+        </w:rPr>
+        <w:t>Villa Romana di Casignana</w:t>
+      </w:r>
+      <w:r>
+        <w:t>, famosa per i suoi splendidi mosaici.</w:t>
+      </w:r>
+    </w:p>
+    <w:p>
+      <w:pPr>
+        <w:rPr>
+          <w:b/>
+          <w:bCs/>
+        </w:rPr>
+      </w:pPr>
+      <w:r>
+        <w:rPr>
+          <w:b/>
+          <w:bCs/>
+        </w:rPr>
+        <w:t>Periodo bizantino e medievale</w:t>
+      </w:r>
+    </w:p>
+    <w:p>
+      <w:r>
+        <w:t>Tra i monumenti religiosi più affascinanti:</w:t>
+      </w:r>
+    </w:p>
+    <w:p>
+      <w:pPr>
+        <w:numPr>
+          <w:ilvl w:val="0"/>
+          <w:numId w:val="8"/>
+        </w:numPr>
+      </w:pPr>
+      <w:r>
+        <w:t>Cattedrale di Gerace</w:t>
+      </w:r>
+    </w:p>
+    <w:p>
+      <w:pPr>
+        <w:numPr>
+          <w:ilvl w:val="0"/>
+          <w:numId w:val="8"/>
+        </w:numPr>
+      </w:pPr>
+      <w:r>
+        <w:t>Cattolica di Stilo</w:t>
+      </w:r>
+    </w:p>
+    <w:p>
+      <w:r>
+        <w:t>Questi luoghi rappresentano alcune delle testimonianze più suggestive dell’arte bizantina nel Sud Italia.</w:t>
+      </w:r>
+    </w:p>
+    <w:p>
+      <w:pPr>
+        <w:rPr>
+          <w:b/>
+          <w:bCs/>
+        </w:rPr>
+      </w:pPr>
+      <w:r>
+        <w:rPr>
+          <w:b/>
+          <w:bCs/>
+        </w:rPr>
+        <w:t>Arte contemporanea nel cuore della Calabria</w:t>
+      </w:r>
+    </w:p>
+    <w:p>
+      <w:r>
+        <w:t>Un’esperienza unica è il Parco Museo Santa Barbara, fondato dall’artista Nik Spatari.</w:t>
+      </w:r>
+    </w:p>
+    <w:p>
+      <w:r>
+        <w:t>Questo museo immerso nella natura è considerato da molti critici uno dei più importanti parchi museali di arte contemporanea a livello internazionale.</w:t>
+      </w:r>
+    </w:p>
+    <w:p/>
+    <w:p>
+      <w:pPr>
+        <w:rPr>
+          <w:b/>
+          <w:bCs/>
+        </w:rPr>
+      </w:pPr>
+      <w:r>
+        <w:rPr>
+          <w:b/>
+          <w:bCs/>
+        </w:rPr>
+        <w:t>LOCRI: LA CULLA DELLA GRECITÀ CALABRESE</w:t>
+      </w:r>
+    </w:p>
+    <w:p/>
+    <w:p>
+      <w:r>
+        <w:t xml:space="preserve">Situata sulla splendida Riviera dei Gelsomini, affacciata sul Mar Ionio, </w:t>
+      </w:r>
+      <w:r>
+        <w:rPr>
+          <w:b/>
+          <w:bCs/>
+        </w:rPr>
+        <w:t>Locri</w:t>
+      </w:r>
+      <w:r>
+        <w:t xml:space="preserve"> è una città ricca di storia e cultura. Fondata tra l’VIII e il VII secolo a.C. dai Greci della Locride con il nome di </w:t>
+      </w:r>
+      <w:r>
+        <w:rPr>
+          <w:b/>
+          <w:bCs/>
+        </w:rPr>
+        <w:t xml:space="preserve">Locri </w:t>
+      </w:r>
+      <w:proofErr w:type="spellStart"/>
+      <w:r>
+        <w:rPr>
+          <w:b/>
+          <w:bCs/>
+        </w:rPr>
+        <w:t>Epizefiri</w:t>
+      </w:r>
+      <w:proofErr w:type="spellEnd"/>
+      <w:r>
+        <w:t xml:space="preserve">, fu uno dei più importanti centri della Magna Grecia. È la terra del legislatore </w:t>
+      </w:r>
+      <w:r>
+        <w:rPr>
+          <w:b/>
+          <w:bCs/>
+        </w:rPr>
+        <w:t>Zaleuco</w:t>
+      </w:r>
+      <w:r>
+        <w:t xml:space="preserve">, considerato il primo legislatore del mondo occidentale, e della poetessa </w:t>
+      </w:r>
+      <w:proofErr w:type="spellStart"/>
+      <w:r>
+        <w:rPr>
+          <w:b/>
+          <w:bCs/>
+        </w:rPr>
+        <w:t>Nosside</w:t>
+      </w:r>
+      <w:proofErr w:type="spellEnd"/>
+      <w:r>
+        <w:t>, una delle voci più raffinate della lirica greca antica.</w:t>
+      </w:r>
+    </w:p>
+    <w:p>
+      <w:r>
+        <w:t xml:space="preserve">Il patrimonio storico della città è oggi raccontato attraverso importanti luoghi culturali. </w:t>
+      </w:r>
+    </w:p>
+    <w:p>
+      <w:r>
+        <w:rPr>
+          <w:b/>
+          <w:bCs/>
+        </w:rPr>
+        <w:t xml:space="preserve">Il Museo e il Parco Archeologico di Locri </w:t>
+      </w:r>
+      <w:proofErr w:type="spellStart"/>
+      <w:r>
+        <w:rPr>
+          <w:b/>
+          <w:bCs/>
+        </w:rPr>
+        <w:t>Epizefiri</w:t>
+      </w:r>
+      <w:proofErr w:type="spellEnd"/>
+      <w:r>
+        <w:t xml:space="preserve"> rappresentano oggi uno dei più importanti complessi archeologici della Calabria, testimoniando la ricchezza culturale della città dalla Magna Grecia fino all’epoca romana.</w:t>
+      </w:r>
+    </w:p>
+    <w:p>
+      <w:r>
+        <w:t>Il Museo è interamente dedicato all’antica polis della Magna Grecia e conserva alcuni dei reperti più significativi provenienti dagli scavi dell’area archeologica. Tra questi si trovano vasi, pinakes votivi, strumenti della vita quotidiana e resti architettonici.</w:t>
+      </w:r>
+    </w:p>
+    <w:p>
+      <w:r>
+        <w:t>Una sezione particolarmente interessante è dedicata alla figura della donna locrese, con la ricostruzione di un antico telaio e oggetti legati alla vita domestica e alle attività femminili dell’epoca.</w:t>
+      </w:r>
+    </w:p>
+    <w:p>
+      <w:r>
+        <w:t xml:space="preserve">All’interno del Parco Archeologico si trova anche il </w:t>
+      </w:r>
+      <w:r>
+        <w:rPr>
+          <w:b/>
+          <w:bCs/>
+        </w:rPr>
+        <w:t>Museo Romano di Locri (Casino Macrì)</w:t>
+      </w:r>
+      <w:r>
+        <w:t>. L’edificio, originariamente una masseria costruita tra XVIII e XIX secolo sopra strutture romane, conserva ancora ambienti antichi come una sala con copertura a volta. Oggi ospita la collezione dei reperti di epoca romana provenienti dal territorio locrese.</w:t>
+      </w:r>
+    </w:p>
+    <w:p>
+      <w:r>
+        <w:t xml:space="preserve">Nel centro storico, il </w:t>
+      </w:r>
+      <w:r>
+        <w:rPr>
+          <w:b/>
+          <w:bCs/>
+        </w:rPr>
+        <w:t>Museo del Territorio di Palazzo Nieddu del Rio</w:t>
+      </w:r>
+      <w:r>
+        <w:t xml:space="preserve"> racconta invece l’evoluzione della città e delle sue tradizioni, collegando l’antica polis greca alla storia più recente del territorio.</w:t>
+      </w:r>
+    </w:p>
+    <w:p>
+      <w:r>
+        <w:t xml:space="preserve">Visitare Locri significa immergersi in un luogo dove storia, cultura e paesaggi della costa ionica calabrese si incontrano, offrendo un affascinante viaggio tra le radici della civiltà mediterranea e il presente. </w:t>
+      </w:r>
+    </w:p>
+    <w:p/>
+    <w:p/>
+    <w:p>
+      <w:pPr>
+        <w:rPr>
+          <w:b/>
+          <w:bCs/>
+        </w:rPr>
+      </w:pPr>
+      <w:r>
+        <w:rPr>
+          <w:b/>
+          <w:bCs/>
+        </w:rPr>
+        <w:t xml:space="preserve">MONASTERACE -Le meraviglie dell’antica </w:t>
+      </w:r>
+      <w:proofErr w:type="spellStart"/>
+      <w:r>
+        <w:rPr>
+          <w:b/>
+          <w:bCs/>
+        </w:rPr>
+        <w:t>Kaulon</w:t>
+      </w:r>
+      <w:proofErr w:type="spellEnd"/>
+    </w:p>
+    <w:p>
+      <w:proofErr w:type="spellStart"/>
+      <w:r>
+        <w:rPr>
+          <w:b/>
+          <w:bCs/>
+        </w:rPr>
+        <w:lastRenderedPageBreak/>
+        <w:t>Kaulon</w:t>
+      </w:r>
+      <w:proofErr w:type="spellEnd"/>
+      <w:r>
+        <w:t xml:space="preserve">, fondata intorno all’VII sec. a.C., sorgeva nell’odierna località di Monasterace Marina presso il promontorio di punta Stilo. </w:t>
+      </w:r>
+    </w:p>
+    <w:p>
+      <w:r>
+        <w:t xml:space="preserve">Di particolare pregio sono i resti rinvenuti in quella che era l’area sacra dell’abitato che corrispondono tra gli altri ad un Tempio Dorico periptero risalante al V sec. </w:t>
+      </w:r>
+      <w:proofErr w:type="spellStart"/>
+      <w:r>
+        <w:t>a.C</w:t>
+      </w:r>
+      <w:proofErr w:type="spellEnd"/>
+      <w:r>
+        <w:t xml:space="preserve"> e quelli rinvenuti nell’area denominata “</w:t>
+      </w:r>
+      <w:r>
+        <w:rPr>
+          <w:b/>
+          <w:bCs/>
+        </w:rPr>
+        <w:t>Casa Matta</w:t>
+      </w:r>
+      <w:r>
+        <w:t xml:space="preserve">”, imponente edificio termale che custodisce un reperto di enorme valore storico-archeologico: un mosaico policromo di 25 mq di superficie raffigurante un drago, dei delfini e dei motivi floreali, </w:t>
+      </w:r>
+      <w:r>
+        <w:rPr>
+          <w:u w:val="single"/>
+        </w:rPr>
+        <w:t>ritenuto il più grande mosaico risalente all'epoca ellenistica mai ritrovato in Italia</w:t>
+      </w:r>
+      <w:r>
+        <w:t>.</w:t>
+      </w:r>
+    </w:p>
+    <w:p>
+      <w:r>
+        <w:t xml:space="preserve">Quello rinvenuto nel sito di Casa Matta non è l’unico Drago di </w:t>
+      </w:r>
+      <w:proofErr w:type="spellStart"/>
+      <w:r>
+        <w:t>Kaulon</w:t>
+      </w:r>
+      <w:proofErr w:type="spellEnd"/>
+      <w:r>
+        <w:t>. All’interno del parco, infatti, sono conservati i resti di un’antica abitazione di lusso che custodiva al suo interno un’opera musiva pavimentale raffigurante un drago marino, databile al III sec., ora conservata presso il Museo di Monasterace.</w:t>
+      </w:r>
+    </w:p>
+    <w:p>
+      <w:r>
+        <w:t>È compresa nel Parco anche una vasta area archeologica subacquea che si estende tra il tempio dorico e l’attuale corso della fiumara Assi, con oltre 200 reperti.</w:t>
+      </w:r>
+    </w:p>
+    <w:p>
+      <w:r>
+        <w:t xml:space="preserve">Ciò che è riaffiorato a seguito degli scavi e dal ricupero subacqueo nell’area è conservato presso il </w:t>
+      </w:r>
+      <w:r>
+        <w:rPr>
+          <w:b/>
+          <w:bCs/>
+        </w:rPr>
+        <w:t>Museo Archeologico di Monasterace Marina</w:t>
+      </w:r>
+      <w:r>
+        <w:t xml:space="preserve">. </w:t>
+      </w:r>
+    </w:p>
+    <w:p/>
+    <w:p>
+      <w:pPr>
+        <w:rPr>
+          <w:b/>
+        </w:rPr>
+      </w:pPr>
+      <w:r>
+        <w:rPr>
+          <w:b/>
+        </w:rPr>
+        <w:t>PARCO ARCHEOLOGICO DEL NANIGLIO (MARINA DI GIOIOSA JONICA)</w:t>
+      </w:r>
+    </w:p>
+    <w:p>
+      <w:r>
+        <w:t xml:space="preserve">Il </w:t>
+      </w:r>
+      <w:r>
+        <w:rPr>
+          <w:b/>
+          <w:bCs/>
+        </w:rPr>
+        <w:t xml:space="preserve">Parco Archeologico del </w:t>
+      </w:r>
+      <w:proofErr w:type="spellStart"/>
+      <w:r>
+        <w:rPr>
+          <w:b/>
+          <w:bCs/>
+        </w:rPr>
+        <w:t>Naniglio</w:t>
+      </w:r>
+      <w:proofErr w:type="spellEnd"/>
+      <w:r>
+        <w:t xml:space="preserve">, situato nel territorio di Gioiosa Ionica nella valle del fiume Torbido, in Calabria, conserva i resti di una delle più interessanti ville romane della regione: la </w:t>
+      </w:r>
+      <w:r>
+        <w:rPr>
+          <w:b/>
+          <w:bCs/>
+        </w:rPr>
+        <w:t xml:space="preserve">Villa romana del </w:t>
+      </w:r>
+      <w:proofErr w:type="spellStart"/>
+      <w:r>
+        <w:rPr>
+          <w:b/>
+          <w:bCs/>
+        </w:rPr>
+        <w:t>Naniglio</w:t>
+      </w:r>
+      <w:proofErr w:type="spellEnd"/>
+      <w:r>
+        <w:t>, costruita tra la fine del I secolo a.C. e l’inizio dell’età imperiale.</w:t>
+      </w:r>
+    </w:p>
+    <w:p>
+      <w:r>
+        <w:t>La villa apparteneva probabilmente a una ricca famiglia romana e rappresentava sia una residenza di prestigio sia il centro amministrativo di una grande proprietà agricola. Il complesso comprende ambienti residenziali decorati con mosaici, strutture architettoniche ben conservate e un imponente sistema sotterraneo per la gestione dell’acqua.</w:t>
+      </w:r>
+    </w:p>
+    <w:p>
+      <w:r>
+        <w:t xml:space="preserve">L’elemento più spettacolare del sito è infatti il grande complesso ipogeo, formato da tre ambienti comunicanti con volte sostenute da pilastri e illuminati da lucernari. Questo spazio era probabilmente utilizzato come cisterna per la raccolta dell’acqua e come </w:t>
+      </w:r>
+      <w:r>
+        <w:rPr>
+          <w:b/>
+          <w:bCs/>
+        </w:rPr>
+        <w:t>ninfeo</w:t>
+      </w:r>
+      <w:r>
+        <w:t>, un luogo dedicato all’acqua e al relax tipico delle ville romane.</w:t>
+      </w:r>
+    </w:p>
+    <w:p>
+      <w:r>
+        <w:t>Gli scavi archeologici, iniziati negli anni ’80 del Novecento, hanno riportato alla luce mosaici policromi e numerose strutture della villa, testimonianza della ricchezza e dell’importanza economica della zona della Locride in epoca romana, legata alla produzione agricola di olio, vino e all’allevamento.</w:t>
+      </w:r>
+    </w:p>
+    <w:p>
+      <w:r>
+        <w:t xml:space="preserve">Oggi il Parco Archeologico del </w:t>
+      </w:r>
+      <w:proofErr w:type="spellStart"/>
+      <w:r>
+        <w:t>Naniglio</w:t>
+      </w:r>
+      <w:proofErr w:type="spellEnd"/>
+      <w:r>
+        <w:t xml:space="preserve"> rappresenta una delle testimonianze più significative della vita rurale romana nella Locride e un luogo di grande interesse storico e culturale</w:t>
+      </w:r>
+    </w:p>
+    <w:p/>
+    <w:p>
+      <w:pPr>
+        <w:rPr>
+          <w:b/>
+          <w:bCs/>
+        </w:rPr>
+      </w:pPr>
+      <w:r>
+        <w:rPr>
+          <w:b/>
+          <w:bCs/>
+        </w:rPr>
+        <w:t>PLATI’</w:t>
+      </w:r>
+    </w:p>
+    <w:p>
+      <w:r>
+        <w:t xml:space="preserve">Il borgo di Platì si trova nella Città Metropolitana di Reggio Calabria, nella zona della Locride, ai piedi del Parco Nazionale dell’Aspromonte. È un piccolo paese di montagna con circa 3.700 abitanti, circondato da colline, boschi e paesaggi naturali tipici dell’Aspromonte. Le origini del borgo risalgono al XVI secolo, quando nacque come piccolo centro agricolo e pastorale, e nel tempo ha conservato molte tradizioni e aspetti della cultura calabrese. Il centro storico è caratterizzato da vicoli stretti, case costruite una accanto all’altra e piccole piazze dove gli abitanti si incontrano e condividono la vita quotidiana. </w:t>
+      </w:r>
+    </w:p>
+    <w:p>
+      <w:r>
+        <w:t xml:space="preserve">Il territorio del comune è molto ampio e comprende anche alcune frazioni, tra cui </w:t>
+      </w:r>
+      <w:r>
+        <w:rPr>
+          <w:b/>
+          <w:bCs/>
+        </w:rPr>
+        <w:t>Cirella</w:t>
+      </w:r>
+      <w:r>
+        <w:t xml:space="preserve">, dove si trova la suggestiva </w:t>
+      </w:r>
+      <w:r>
+        <w:rPr>
+          <w:b/>
+          <w:bCs/>
+        </w:rPr>
+        <w:t>cascata dello Schioppo</w:t>
+      </w:r>
+      <w:r>
+        <w:t xml:space="preserve">, una cascata naturale immersa nel verde che rappresenta uno dei luoghi più caratteristici della zona. </w:t>
+      </w:r>
+    </w:p>
+    <w:p>
+      <w:r>
+        <w:lastRenderedPageBreak/>
+        <w:t>Grazie alla sua posizione nell’Aspromonte, Platì offre un ambiente naturale ricco di vegetazione, aria pulita e panorami molto suggestivi, ideali per escursioni, passeggiate e turismo naturalistico</w:t>
+      </w:r>
+    </w:p>
+    <w:p/>
+    <w:p>
+      <w:pPr>
+        <w:rPr>
+          <w:b/>
+          <w:bCs/>
+        </w:rPr>
+      </w:pPr>
+      <w:r>
+        <w:rPr>
+          <w:b/>
+          <w:bCs/>
+        </w:rPr>
+        <w:t>SIDERNO</w:t>
+      </w:r>
+    </w:p>
+    <w:p>
+      <w:r>
+        <w:rPr>
+          <w:b/>
+          <w:bCs/>
+        </w:rPr>
+        <w:t>Siderno Superiore</w:t>
+      </w:r>
+      <w:r>
+        <w:t xml:space="preserve"> è un affascinante borgo medievale situato sulle colline della Locride dove il tempo sembra essersi fermato. Tra vicoli stretti, palazzi nobiliari con portali in pietra e scorci panoramici sul Mar Ionio, il borgo conserva l’atmosfera autentica della Calabria più antica.</w:t>
+      </w:r>
+    </w:p>
+    <w:p>
+      <w:r>
+        <w:t>Tra i luoghi più rappresentativi si trova la Chiesa di San Nicola di Bari, mentre il cuore del paese è Piazza Cavone, una terrazza naturale che offre una splendida vista sulla costa ionica.</w:t>
+      </w:r>
+    </w:p>
+    <w:p>
+      <w:r>
+        <w:t>L’insediamento attuale si sviluppò tra il XIV e il XV secolo e nel 1532 fu elevato a baronia autonoma dall’imperatore Carlo V. In passato il borgo era protetto da mura e torri difensive volute dal conte Giovan Battista Carafa. Tra queste spiccava la Torre Tamburi, costruita nel XIV secolo in epoca angioina e demolita nel 1893.</w:t>
+      </w:r>
+    </w:p>
+    <w:p>
+      <w:r>
+        <w:t>Oggi Siderno Superiore è al centro di progetti di tutela e valorizzazione turistica, con visite guidate e iniziative dedicate alla scoperta del suo patrimonio storico, culturale e paesaggistico.</w:t>
+      </w:r>
+    </w:p>
+    <w:p/>
+    <w:p/>
+    <w:p>
+      <w:r>
+        <w:lastRenderedPageBreak/>
+        <w:drawing>
+          <wp:inline distT="0" distB="0" distL="0" distR="0" wp14:anchorId="1CCDD741" wp14:editId="63E102FE">
+            <wp:extent cx="6115050" cy="6086475"/>
+            <wp:effectExtent l="0" t="0" r="0" b="9525"/>
+            <wp:docPr id="2" name="Immagine 2"/>
+            <wp:cNvGraphicFramePr>
+              <a:graphicFrameLocks xmlns:a="http://schemas.openxmlformats.org/drawingml/2006/main" noChangeAspect="1"/>
+            </wp:cNvGraphicFramePr>
+            <a:graphic xmlns:a="http://schemas.openxmlformats.org/drawingml/2006/main">
+              <a:graphicData uri="http://schemas.openxmlformats.org/drawingml/2006/picture">
+                <pic:pic xmlns:pic="http://schemas.openxmlformats.org/drawingml/2006/picture">
+                  <pic:nvPicPr>
+                    <pic:cNvPr id="0" name="Immagine 2"/>
+                    <pic:cNvPicPr>
+                      <a:picLocks noChangeAspect="1" noChangeArrowheads="1"/>
+                    </pic:cNvPicPr>
+                  </pic:nvPicPr>
+                  <pic:blipFill>
+                    <a:blip r:embed="rId8">
+                      <a:extLst>
+                        <a:ext uri="{28A0092B-C50C-407E-A947-70E740481C1C}">
+                          <a14:useLocalDpi xmlns:a14="http://schemas.microsoft.com/office/drawing/2010/main" val="0"/>
+                        </a:ext>
+                      </a:extLst>
+                    </a:blip>
+                    <a:srcRect/>
+                    <a:stretch>
+                      <a:fillRect/>
+                    </a:stretch>
+                  </pic:blipFill>
+                  <pic:spPr bwMode="auto">
+                    <a:xfrm>
+                      <a:off x="0" y="0"/>
+                      <a:ext cx="6115050" cy="6086475"/>
+                    </a:xfrm>
+                    <a:prstGeom prst="rect">
+                      <a:avLst/>
+                    </a:prstGeom>
+                    <a:noFill/>
+                    <a:ln>
+                      <a:noFill/>
+                    </a:ln>
+                  </pic:spPr>
+                </pic:pic>
+              </a:graphicData>
+            </a:graphic>
+          </wp:inline>
+        </w:drawing>
+      </w:r>
+    </w:p>
+    <w:p/>
     <w:sectPr>
       <w:pgSz w:w="11900" w:h="16840"/>
       <w:pgMar w:top="1417" w:right="1134" w:bottom="1134" w:left="1134" w:header="708" w:footer="708" w:gutter="0"/>
@@ -7085,6 +8377,453 @@
       </w:rPr>
     </w:lvl>
   </w:abstractNum>
+  <w:abstractNum w:abstractNumId="5" w15:restartNumberingAfterBreak="0">
+    <w:nsid w:val="6660399E"/>
+    <w:multiLevelType w:val="multilevel"/>
+    <w:tmpl w:val="485083C2"/>
+    <w:lvl w:ilvl="0">
+      <w:start w:val="1"/>
+      <w:numFmt w:val="bullet"/>
+      <w:lvlText w:val=""/>
+      <w:lvlJc w:val="left"/>
+      <w:pPr>
+        <w:tabs>
+          <w:tab w:val="num" w:pos="720"/>
+        </w:tabs>
+        <w:ind w:left="720" w:hanging="360"/>
+      </w:pPr>
+      <w:rPr>
+        <w:rFonts w:ascii="Symbol" w:hAnsi="Symbol" w:hint="default"/>
+        <w:sz w:val="20"/>
+      </w:rPr>
+    </w:lvl>
+    <w:lvl w:ilvl="1">
+      <w:start w:val="1"/>
+      <w:numFmt w:val="bullet"/>
+      <w:lvlText w:val="o"/>
+      <w:lvlJc w:val="left"/>
+      <w:pPr>
+        <w:tabs>
+          <w:tab w:val="num" w:pos="1440"/>
+        </w:tabs>
+        <w:ind w:left="1440" w:hanging="360"/>
+      </w:pPr>
+      <w:rPr>
+        <w:rFonts w:ascii="Courier New" w:hAnsi="Courier New" w:cs="Times New Roman" w:hint="default"/>
+        <w:sz w:val="20"/>
+      </w:rPr>
+    </w:lvl>
+    <w:lvl w:ilvl="2">
+      <w:start w:val="1"/>
+      <w:numFmt w:val="bullet"/>
+      <w:lvlText w:val=""/>
+      <w:lvlJc w:val="left"/>
+      <w:pPr>
+        <w:tabs>
+          <w:tab w:val="num" w:pos="2160"/>
+        </w:tabs>
+        <w:ind w:left="2160" w:hanging="360"/>
+      </w:pPr>
+      <w:rPr>
+        <w:rFonts w:ascii="Wingdings" w:hAnsi="Wingdings" w:hint="default"/>
+        <w:sz w:val="20"/>
+      </w:rPr>
+    </w:lvl>
+    <w:lvl w:ilvl="3">
+      <w:start w:val="1"/>
+      <w:numFmt w:val="bullet"/>
+      <w:lvlText w:val=""/>
+      <w:lvlJc w:val="left"/>
+      <w:pPr>
+        <w:tabs>
+          <w:tab w:val="num" w:pos="2880"/>
+        </w:tabs>
+        <w:ind w:left="2880" w:hanging="360"/>
+      </w:pPr>
+      <w:rPr>
+        <w:rFonts w:ascii="Wingdings" w:hAnsi="Wingdings" w:hint="default"/>
+        <w:sz w:val="20"/>
+      </w:rPr>
+    </w:lvl>
+    <w:lvl w:ilvl="4">
+      <w:start w:val="1"/>
+      <w:numFmt w:val="bullet"/>
+      <w:lvlText w:val=""/>
+      <w:lvlJc w:val="left"/>
+      <w:pPr>
+        <w:tabs>
+          <w:tab w:val="num" w:pos="3600"/>
+        </w:tabs>
+        <w:ind w:left="3600" w:hanging="360"/>
+      </w:pPr>
+      <w:rPr>
+        <w:rFonts w:ascii="Wingdings" w:hAnsi="Wingdings" w:hint="default"/>
+        <w:sz w:val="20"/>
+      </w:rPr>
+    </w:lvl>
+    <w:lvl w:ilvl="5">
+      <w:start w:val="1"/>
+      <w:numFmt w:val="bullet"/>
+      <w:lvlText w:val=""/>
+      <w:lvlJc w:val="left"/>
+      <w:pPr>
+        <w:tabs>
+          <w:tab w:val="num" w:pos="4320"/>
+        </w:tabs>
+        <w:ind w:left="4320" w:hanging="360"/>
+      </w:pPr>
+      <w:rPr>
+        <w:rFonts w:ascii="Wingdings" w:hAnsi="Wingdings" w:hint="default"/>
+        <w:sz w:val="20"/>
+      </w:rPr>
+    </w:lvl>
+    <w:lvl w:ilvl="6">
+      <w:start w:val="1"/>
+      <w:numFmt w:val="bullet"/>
+      <w:lvlText w:val=""/>
+      <w:lvlJc w:val="left"/>
+      <w:pPr>
+        <w:tabs>
+          <w:tab w:val="num" w:pos="5040"/>
+        </w:tabs>
+        <w:ind w:left="5040" w:hanging="360"/>
+      </w:pPr>
+      <w:rPr>
+        <w:rFonts w:ascii="Wingdings" w:hAnsi="Wingdings" w:hint="default"/>
+        <w:sz w:val="20"/>
+      </w:rPr>
+    </w:lvl>
+    <w:lvl w:ilvl="7">
+      <w:start w:val="1"/>
+      <w:numFmt w:val="bullet"/>
+      <w:lvlText w:val=""/>
+      <w:lvlJc w:val="left"/>
+      <w:pPr>
+        <w:tabs>
+          <w:tab w:val="num" w:pos="5760"/>
+        </w:tabs>
+        <w:ind w:left="5760" w:hanging="360"/>
+      </w:pPr>
+      <w:rPr>
+        <w:rFonts w:ascii="Wingdings" w:hAnsi="Wingdings" w:hint="default"/>
+        <w:sz w:val="20"/>
+      </w:rPr>
+    </w:lvl>
+    <w:lvl w:ilvl="8">
+      <w:start w:val="1"/>
+      <w:numFmt w:val="bullet"/>
+      <w:lvlText w:val=""/>
+      <w:lvlJc w:val="left"/>
+      <w:pPr>
+        <w:tabs>
+          <w:tab w:val="num" w:pos="6480"/>
+        </w:tabs>
+        <w:ind w:left="6480" w:hanging="360"/>
+      </w:pPr>
+      <w:rPr>
+        <w:rFonts w:ascii="Wingdings" w:hAnsi="Wingdings" w:hint="default"/>
+        <w:sz w:val="20"/>
+      </w:rPr>
+    </w:lvl>
+  </w:abstractNum>
+  <w:abstractNum w:abstractNumId="6" w15:restartNumberingAfterBreak="0">
+    <w:nsid w:val="6CF42300"/>
+    <w:multiLevelType w:val="multilevel"/>
+    <w:tmpl w:val="E2A0AD86"/>
+    <w:lvl w:ilvl="0">
+      <w:start w:val="1"/>
+      <w:numFmt w:val="bullet"/>
+      <w:lvlText w:val=""/>
+      <w:lvlJc w:val="left"/>
+      <w:pPr>
+        <w:tabs>
+          <w:tab w:val="num" w:pos="720"/>
+        </w:tabs>
+        <w:ind w:left="720" w:hanging="360"/>
+      </w:pPr>
+      <w:rPr>
+        <w:rFonts w:ascii="Symbol" w:hAnsi="Symbol" w:hint="default"/>
+        <w:sz w:val="20"/>
+      </w:rPr>
+    </w:lvl>
+    <w:lvl w:ilvl="1">
+      <w:start w:val="1"/>
+      <w:numFmt w:val="bullet"/>
+      <w:lvlText w:val="o"/>
+      <w:lvlJc w:val="left"/>
+      <w:pPr>
+        <w:tabs>
+          <w:tab w:val="num" w:pos="1440"/>
+        </w:tabs>
+        <w:ind w:left="1440" w:hanging="360"/>
+      </w:pPr>
+      <w:rPr>
+        <w:rFonts w:ascii="Courier New" w:hAnsi="Courier New" w:cs="Times New Roman" w:hint="default"/>
+        <w:sz w:val="20"/>
+      </w:rPr>
+    </w:lvl>
+    <w:lvl w:ilvl="2">
+      <w:start w:val="1"/>
+      <w:numFmt w:val="bullet"/>
+      <w:lvlText w:val=""/>
+      <w:lvlJc w:val="left"/>
+      <w:pPr>
+        <w:tabs>
+          <w:tab w:val="num" w:pos="2160"/>
+        </w:tabs>
+        <w:ind w:left="2160" w:hanging="360"/>
+      </w:pPr>
+      <w:rPr>
+        <w:rFonts w:ascii="Wingdings" w:hAnsi="Wingdings" w:hint="default"/>
+        <w:sz w:val="20"/>
+      </w:rPr>
+    </w:lvl>
+    <w:lvl w:ilvl="3">
+      <w:start w:val="1"/>
+      <w:numFmt w:val="bullet"/>
+      <w:lvlText w:val=""/>
+      <w:lvlJc w:val="left"/>
+      <w:pPr>
+        <w:tabs>
+          <w:tab w:val="num" w:pos="2880"/>
+        </w:tabs>
+        <w:ind w:left="2880" w:hanging="360"/>
+      </w:pPr>
+      <w:rPr>
+        <w:rFonts w:ascii="Wingdings" w:hAnsi="Wingdings" w:hint="default"/>
+        <w:sz w:val="20"/>
+      </w:rPr>
+    </w:lvl>
+    <w:lvl w:ilvl="4">
+      <w:start w:val="1"/>
+      <w:numFmt w:val="bullet"/>
+      <w:lvlText w:val=""/>
+      <w:lvlJc w:val="left"/>
+      <w:pPr>
+        <w:tabs>
+          <w:tab w:val="num" w:pos="3600"/>
+        </w:tabs>
+        <w:ind w:left="3600" w:hanging="360"/>
+      </w:pPr>
+      <w:rPr>
+        <w:rFonts w:ascii="Wingdings" w:hAnsi="Wingdings" w:hint="default"/>
+        <w:sz w:val="20"/>
+      </w:rPr>
+    </w:lvl>
+    <w:lvl w:ilvl="5">
+      <w:start w:val="1"/>
+      <w:numFmt w:val="bullet"/>
+      <w:lvlText w:val=""/>
+      <w:lvlJc w:val="left"/>
+      <w:pPr>
+        <w:tabs>
+          <w:tab w:val="num" w:pos="4320"/>
+        </w:tabs>
+        <w:ind w:left="4320" w:hanging="360"/>
+      </w:pPr>
+      <w:rPr>
+        <w:rFonts w:ascii="Wingdings" w:hAnsi="Wingdings" w:hint="default"/>
+        <w:sz w:val="20"/>
+      </w:rPr>
+    </w:lvl>
+    <w:lvl w:ilvl="6">
+      <w:start w:val="1"/>
+      <w:numFmt w:val="bullet"/>
+      <w:lvlText w:val=""/>
+      <w:lvlJc w:val="left"/>
+      <w:pPr>
+        <w:tabs>
+          <w:tab w:val="num" w:pos="5040"/>
+        </w:tabs>
+        <w:ind w:left="5040" w:hanging="360"/>
+      </w:pPr>
+      <w:rPr>
+        <w:rFonts w:ascii="Wingdings" w:hAnsi="Wingdings" w:hint="default"/>
+        <w:sz w:val="20"/>
+      </w:rPr>
+    </w:lvl>
+    <w:lvl w:ilvl="7">
+      <w:start w:val="1"/>
+      <w:numFmt w:val="bullet"/>
+      <w:lvlText w:val=""/>
+      <w:lvlJc w:val="left"/>
+      <w:pPr>
+        <w:tabs>
+          <w:tab w:val="num" w:pos="5760"/>
+        </w:tabs>
+        <w:ind w:left="5760" w:hanging="360"/>
+      </w:pPr>
+      <w:rPr>
+        <w:rFonts w:ascii="Wingdings" w:hAnsi="Wingdings" w:hint="default"/>
+        <w:sz w:val="20"/>
+      </w:rPr>
+    </w:lvl>
+    <w:lvl w:ilvl="8">
+      <w:start w:val="1"/>
+      <w:numFmt w:val="bullet"/>
+      <w:lvlText w:val=""/>
+      <w:lvlJc w:val="left"/>
+      <w:pPr>
+        <w:tabs>
+          <w:tab w:val="num" w:pos="6480"/>
+        </w:tabs>
+        <w:ind w:left="6480" w:hanging="360"/>
+      </w:pPr>
+      <w:rPr>
+        <w:rFonts w:ascii="Wingdings" w:hAnsi="Wingdings" w:hint="default"/>
+        <w:sz w:val="20"/>
+      </w:rPr>
+    </w:lvl>
+  </w:abstractNum>
+  <w:abstractNum w:abstractNumId="7" w15:restartNumberingAfterBreak="0">
+    <w:nsid w:val="6E404F32"/>
+    <w:multiLevelType w:val="multilevel"/>
+    <w:tmpl w:val="118EF986"/>
+    <w:lvl w:ilvl="0">
+      <w:start w:val="1"/>
+      <w:numFmt w:val="bullet"/>
+      <w:lvlText w:val=""/>
+      <w:lvlJc w:val="left"/>
+      <w:pPr>
+        <w:tabs>
+          <w:tab w:val="num" w:pos="720"/>
+        </w:tabs>
+        <w:ind w:left="720" w:hanging="360"/>
+      </w:pPr>
+      <w:rPr>
+        <w:rFonts w:ascii="Symbol" w:hAnsi="Symbol" w:hint="default"/>
+        <w:sz w:val="20"/>
+      </w:rPr>
+    </w:lvl>
+    <w:lvl w:ilvl="1">
+      <w:start w:val="1"/>
+      <w:numFmt w:val="bullet"/>
+      <w:lvlText w:val="o"/>
+      <w:lvlJc w:val="left"/>
+      <w:pPr>
+        <w:tabs>
+          <w:tab w:val="num" w:pos="1440"/>
+        </w:tabs>
+        <w:ind w:left="1440" w:hanging="360"/>
+      </w:pPr>
+      <w:rPr>
+        <w:rFonts w:ascii="Courier New" w:hAnsi="Courier New" w:cs="Times New Roman" w:hint="default"/>
+        <w:sz w:val="20"/>
+      </w:rPr>
+    </w:lvl>
+    <w:lvl w:ilvl="2">
+      <w:start w:val="1"/>
+      <w:numFmt w:val="bullet"/>
+      <w:lvlText w:val=""/>
+      <w:lvlJc w:val="left"/>
+      <w:pPr>
+        <w:tabs>
+          <w:tab w:val="num" w:pos="2160"/>
+        </w:tabs>
+        <w:ind w:left="2160" w:hanging="360"/>
+      </w:pPr>
+      <w:rPr>
+        <w:rFonts w:ascii="Wingdings" w:hAnsi="Wingdings" w:hint="default"/>
+        <w:sz w:val="20"/>
+      </w:rPr>
+    </w:lvl>
+    <w:lvl w:ilvl="3">
+      <w:start w:val="1"/>
+      <w:numFmt w:val="bullet"/>
+      <w:lvlText w:val=""/>
+      <w:lvlJc w:val="left"/>
+      <w:pPr>
+        <w:tabs>
+          <w:tab w:val="num" w:pos="2880"/>
+        </w:tabs>
+        <w:ind w:left="2880" w:hanging="360"/>
+      </w:pPr>
+      <w:rPr>
+        <w:rFonts w:ascii="Wingdings" w:hAnsi="Wingdings" w:hint="default"/>
+        <w:sz w:val="20"/>
+      </w:rPr>
+    </w:lvl>
+    <w:lvl w:ilvl="4">
+      <w:start w:val="1"/>
+      <w:numFmt w:val="bullet"/>
+      <w:lvlText w:val=""/>
+      <w:lvlJc w:val="left"/>
+      <w:pPr>
+        <w:tabs>
+          <w:tab w:val="num" w:pos="3600"/>
+        </w:tabs>
+        <w:ind w:left="3600" w:hanging="360"/>
+      </w:pPr>
+      <w:rPr>
+        <w:rFonts w:ascii="Wingdings" w:hAnsi="Wingdings" w:hint="default"/>
+        <w:sz w:val="20"/>
+      </w:rPr>
+    </w:lvl>
+    <w:lvl w:ilvl="5">
+      <w:start w:val="1"/>
+      <w:numFmt w:val="bullet"/>
+      <w:lvlText w:val=""/>
+      <w:lvlJc w:val="left"/>
+      <w:pPr>
+        <w:tabs>
+          <w:tab w:val="num" w:pos="4320"/>
+        </w:tabs>
+        <w:ind w:left="4320" w:hanging="360"/>
+      </w:pPr>
+      <w:rPr>
+        <w:rFonts w:ascii="Wingdings" w:hAnsi="Wingdings" w:hint="default"/>
+        <w:sz w:val="20"/>
+      </w:rPr>
+    </w:lvl>
+    <w:lvl w:ilvl="6">
+      <w:start w:val="1"/>
+      <w:numFmt w:val="bullet"/>
+      <w:lvlText w:val=""/>
+      <w:lvlJc w:val="left"/>
+      <w:pPr>
+        <w:tabs>
+          <w:tab w:val="num" w:pos="5040"/>
+        </w:tabs>
+        <w:ind w:left="5040" w:hanging="360"/>
+      </w:pPr>
+      <w:rPr>
+        <w:rFonts w:ascii="Wingdings" w:hAnsi="Wingdings" w:hint="default"/>
+        <w:sz w:val="20"/>
+      </w:rPr>
+    </w:lvl>
+    <w:lvl w:ilvl="7">
+      <w:start w:val="1"/>
+      <w:numFmt w:val="bullet"/>
+      <w:lvlText w:val=""/>
+      <w:lvlJc w:val="left"/>
+      <w:pPr>
+        <w:tabs>
+          <w:tab w:val="num" w:pos="5760"/>
+        </w:tabs>
+        <w:ind w:left="5760" w:hanging="360"/>
+      </w:pPr>
+      <w:rPr>
+        <w:rFonts w:ascii="Wingdings" w:hAnsi="Wingdings" w:hint="default"/>
+        <w:sz w:val="20"/>
+      </w:rPr>
+    </w:lvl>
+    <w:lvl w:ilvl="8">
+      <w:start w:val="1"/>
+      <w:numFmt w:val="bullet"/>
+      <w:lvlText w:val=""/>
+      <w:lvlJc w:val="left"/>
+      <w:pPr>
+        <w:tabs>
+          <w:tab w:val="num" w:pos="6480"/>
+        </w:tabs>
+        <w:ind w:left="6480" w:hanging="360"/>
+      </w:pPr>
+      <w:rPr>
+        <w:rFonts w:ascii="Wingdings" w:hAnsi="Wingdings" w:hint="default"/>
+        <w:sz w:val="20"/>
+      </w:rPr>
+    </w:lvl>
+  </w:abstractNum>
   <w:num w:numId="1" w16cid:durableId="690451768">
     <w:abstractNumId w:val="3"/>
   </w:num>
@@ -7099,6 +8838,42 @@
   </w:num>
   <w:num w:numId="5" w16cid:durableId="561982785">
     <w:abstractNumId w:val="1"/>
+  </w:num>
+  <w:num w:numId="6" w16cid:durableId="1163351500">
+    <w:abstractNumId w:val="5"/>
+    <w:lvlOverride w:ilvl="0"/>
+    <w:lvlOverride w:ilvl="1"/>
+    <w:lvlOverride w:ilvl="2"/>
+    <w:lvlOverride w:ilvl="3"/>
+    <w:lvlOverride w:ilvl="4"/>
+    <w:lvlOverride w:ilvl="5"/>
+    <w:lvlOverride w:ilvl="6"/>
+    <w:lvlOverride w:ilvl="7"/>
+    <w:lvlOverride w:ilvl="8"/>
+  </w:num>
+  <w:num w:numId="7" w16cid:durableId="1049693490">
+    <w:abstractNumId w:val="6"/>
+    <w:lvlOverride w:ilvl="0"/>
+    <w:lvlOverride w:ilvl="1"/>
+    <w:lvlOverride w:ilvl="2"/>
+    <w:lvlOverride w:ilvl="3"/>
+    <w:lvlOverride w:ilvl="4"/>
+    <w:lvlOverride w:ilvl="5"/>
+    <w:lvlOverride w:ilvl="6"/>
+    <w:lvlOverride w:ilvl="7"/>
+    <w:lvlOverride w:ilvl="8"/>
+  </w:num>
+  <w:num w:numId="8" w16cid:durableId="1650670102">
+    <w:abstractNumId w:val="7"/>
+    <w:lvlOverride w:ilvl="0"/>
+    <w:lvlOverride w:ilvl="1"/>
+    <w:lvlOverride w:ilvl="2"/>
+    <w:lvlOverride w:ilvl="3"/>
+    <w:lvlOverride w:ilvl="4"/>
+    <w:lvlOverride w:ilvl="5"/>
+    <w:lvlOverride w:ilvl="6"/>
+    <w:lvlOverride w:ilvl="7"/>
+    <w:lvlOverride w:ilvl="8"/>
   </w:num>
 </w:numbering>
 </file>
@@ -7708,7 +9483,6 @@
   <w:style w:type="character" w:default="1" w:styleId="Carpredefinitoparagrafo">
     <w:name w:val="Default Paragraph Font"/>
     <w:uiPriority w:val="1"/>
-    <w:semiHidden/>
     <w:unhideWhenUsed/>
   </w:style>
   <w:style w:type="table" w:default="1" w:styleId="Tabellanormale">

</xml_diff>